<commit_message>
17572-3: obrázky 4 a 5 jako obrázky místo tvarů
Obrázek 4 („Zásobník“) byl ve Wordu nakreslený z volných textových polí
a šipek, obrázek 5 („Zakřivení“) měl popisky v odděleném odstavci. Oba
vykreslené a nahrazené jedním obrázkem, odstraněno zbloudilé „/“.
V Markdownu tak poprvé jsou oba obrázky s popisky.

Co-Authored-By: Claude Opus 5.5 <noreply@anthropic.com>
Claude-Session: https://claude.ai/code/session_013XsG4Ss77xGbwrRyA4pUBh
</commit_message>
<xml_diff>
--- a/extrakty/doc/TC278WG7/extract_17572-3_(2015).docx
+++ b/extrakty/doc/TC278WG7/extract_17572-3_(2015).docx
@@ -1931,1217 +1931,41 @@
     <w:p>
       <w:pPr>
         <w:pStyle w:val="Textnormy"/>
-        <w:rPr>
-          <w:rFonts w:ascii="Cambria" w:hAnsi="Cambria" w:cs="Cambria"/>
-        </w:rPr>
-      </w:pPr>
-      <w:r>
-        <w:rPr>
-          <w:rFonts w:cs="Cambria" w:ascii="Cambria" w:hAnsi="Cambria"/>
-          <w:lang w:val="en-US" w:eastAsia="en-US"/>
-        </w:rPr>
-      </w:r>
-      <w:r>
-        <mc:AlternateContent>
-          <mc:Choice Requires="wps">
-            <w:drawing>
-              <wp:anchor distT="0" distB="0" distL="114935" distR="114935" simplePos="0" relativeHeight="16" behindDoc="0" locked="0" layoutInCell="0" allowOverlap="1">
-                <wp:simplePos x="0" y="0"/>
-                <wp:positionH relativeFrom="column">
-                  <wp:posOffset>1371600</wp:posOffset>
-                </wp:positionH>
-                <wp:positionV relativeFrom="paragraph">
-                  <wp:posOffset>179705</wp:posOffset>
-                </wp:positionV>
-                <wp:extent cx="3557270" cy="316230"/>
-                <wp:effectExtent l="0" t="0" r="0" b="0"/>
-                <wp:wrapSquare wrapText="bothSides"/>
-                <wp:docPr id="4" name="Frame1"/>
-                <a:graphic xmlns:a="http://schemas.openxmlformats.org/drawingml/2006/main">
-                  <a:graphicData uri="http://schemas.microsoft.com/office/word/2010/wordprocessingShape">
-                    <wps:wsp>
-                      <wps:cNvSpPr txBox="1"/>
-                      <wps:spPr>
-                        <a:xfrm>
-                          <a:off x="0" y="0"/>
-                          <a:ext cx="3557270" cy="316230"/>
-                        </a:xfrm>
-                        <a:prstGeom prst="rect"/>
-                        <a:solidFill>
-                          <a:srgbClr val="FFFFFF"/>
-                        </a:solidFill>
-                        <a:ln w="9525">
-                          <a:solidFill>
-                            <a:srgbClr val="000000"/>
-                          </a:solidFill>
-                        </a:ln>
-                      </wps:spPr>
-                      <wps:txbx>
-                        <w:txbxContent>
-                          <w:p>
-                            <w:pPr>
-                              <w:pStyle w:val="Normal"/>
-                              <w:ind w:firstLine="1" w:end="0"/>
-                              <w:jc w:val="center"/>
-                              <w:rPr/>
-                            </w:pPr>
-                            <w:r>
-                              <w:rPr>
-                                <w:b/>
-                              </w:rPr>
-                              <w:t>DLR1 OznačeníPoloh</w:t>
-                            </w:r>
-                          </w:p>
-                          <w:p>
-                            <w:pPr>
-                              <w:pStyle w:val="Normal"/>
-                              <w:jc w:val="center"/>
-                              <w:rPr/>
-                            </w:pPr>
-                            <w:r>
-                              <w:rPr/>
-                            </w:r>
-                          </w:p>
-                        </w:txbxContent>
-                      </wps:txbx>
-                      <wps:bodyPr anchor="t" lIns="91440" tIns="91440" rIns="91440" bIns="91440">
-                        <a:noAutofit/>
-                      </wps:bodyPr>
-                    </wps:wsp>
-                  </a:graphicData>
-                </a:graphic>
-              </wp:anchor>
-            </w:drawing>
-          </mc:Choice>
-          <mc:Fallback>
-            <w:pict>
-              <v:rect fillcolor="#FFFFFF" strokecolor="#000000" strokeweight="0pt" style="position:absolute;rotation:-0;width:280.1pt;height:24.9pt;mso-wrap-distance-left:9.05pt;mso-wrap-distance-right:9.05pt;mso-wrap-distance-top:0pt;mso-wrap-distance-bottom:0pt;margin-top:14.15pt;mso-position-vertical-relative:text;margin-left:108pt;mso-position-horizontal-relative:text">
-                <v:textbox inset="0.1in,0.1in,0.1in,0.1in">
-                  <w:txbxContent>
-                    <w:p>
-                      <w:pPr>
-                        <w:pStyle w:val="Normal"/>
-                        <w:ind w:firstLine="1" w:end="0"/>
-                        <w:jc w:val="center"/>
-                        <w:rPr/>
-                      </w:pPr>
-                      <w:r>
-                        <w:rPr>
-                          <w:b/>
-                        </w:rPr>
-                        <w:t>DLR1 OznačeníPoloh</w:t>
-                      </w:r>
-                    </w:p>
-                    <w:p>
-                      <w:pPr>
-                        <w:pStyle w:val="Normal"/>
-                        <w:jc w:val="center"/>
-                        <w:rPr/>
-                      </w:pPr>
-                      <w:r>
-                        <w:rPr/>
-                      </w:r>
-                    </w:p>
-                  </w:txbxContent>
-                </v:textbox>
-                <w10:wrap type="square"/>
-              </v:rect>
-            </w:pict>
-          </mc:Fallback>
-        </mc:AlternateContent>
-      </w:r>
-    </w:p>
-    <w:p>
-      <w:pPr>
-        <w:pStyle w:val="Textnormy"/>
-        <w:rPr>
-          <w:rFonts w:ascii="Cambria" w:hAnsi="Cambria" w:cs="Cambria"/>
-        </w:rPr>
-      </w:pPr>
-      <w:r>
-        <w:rPr>
-          <w:rFonts w:cs="Cambria" w:ascii="Cambria" w:hAnsi="Cambria"/>
-        </w:rPr>
-      </w:r>
-    </w:p>
-    <w:p>
-      <w:pPr>
-        <w:pStyle w:val="Textnormy"/>
-        <w:rPr>
-          <w:rFonts w:ascii="Cambria" w:hAnsi="Cambria" w:cs="Cambria"/>
-        </w:rPr>
-      </w:pPr>
-      <w:r>
-        <w:rPr>
-          <w:rFonts w:cs="Cambria" w:ascii="Cambria" w:hAnsi="Cambria"/>
-          <w:lang w:val="en-US" w:eastAsia="en-US"/>
-        </w:rPr>
-      </w:r>
-      <w:r>
-        <mc:AlternateContent>
-          <mc:Choice Requires="wps">
-            <w:drawing>
-              <wp:anchor distT="0" distB="0" distL="114935" distR="114935" simplePos="0" relativeHeight="6" behindDoc="0" locked="0" layoutInCell="0" allowOverlap="1">
-                <wp:simplePos x="0" y="0"/>
-                <wp:positionH relativeFrom="column">
-                  <wp:posOffset>1371600</wp:posOffset>
-                </wp:positionH>
-                <wp:positionV relativeFrom="paragraph">
-                  <wp:posOffset>32385</wp:posOffset>
-                </wp:positionV>
-                <wp:extent cx="3557270" cy="1028065"/>
-                <wp:effectExtent l="0" t="0" r="0" b="0"/>
-                <wp:wrapSquare wrapText="bothSides"/>
-                <wp:docPr id="5" name="Frame2"/>
-                <a:graphic xmlns:a="http://schemas.openxmlformats.org/drawingml/2006/main">
-                  <a:graphicData uri="http://schemas.microsoft.com/office/word/2010/wordprocessingShape">
-                    <wps:wsp>
-                      <wps:cNvSpPr txBox="1"/>
-                      <wps:spPr>
-                        <a:xfrm>
-                          <a:off x="0" y="0"/>
-                          <a:ext cx="3557270" cy="1028065"/>
-                        </a:xfrm>
-                        <a:prstGeom prst="rect"/>
-                        <a:solidFill>
-                          <a:srgbClr val="FFFFFF"/>
-                        </a:solidFill>
-                        <a:ln w="9525">
-                          <a:solidFill>
-                            <a:srgbClr val="000000"/>
-                          </a:solidFill>
-                        </a:ln>
-                      </wps:spPr>
-                      <wps:txbx>
-                        <w:txbxContent>
-                          <w:p>
-                            <w:pPr>
-                              <w:pStyle w:val="Normal"/>
-                              <w:spacing w:before="0" w:after="40"/>
-                              <w:rPr>
-                                <w:color w:val="943634"/>
-                              </w:rPr>
-                            </w:pPr>
-                            <w:r>
-                              <w:rPr>
-                                <w:color w:val="943634"/>
-                              </w:rPr>
-                              <w:t>+   verze: IntUnTi</w:t>
-                            </w:r>
-                          </w:p>
-                          <w:p>
-                            <w:pPr>
-                              <w:pStyle w:val="Normal"/>
-                              <w:shd w:fill="EEECE1" w:val="clear"/>
-                              <w:spacing w:before="0" w:after="40"/>
-                              <w:rPr/>
-                            </w:pPr>
-                            <w:r>
-                              <w:rPr/>
-                              <w:t>«OrderedComponentGroup»</w:t>
-                            </w:r>
-                          </w:p>
-                          <w:p>
-                            <w:pPr>
-                              <w:pStyle w:val="Normal"/>
-                              <w:spacing w:before="0" w:after="40"/>
-                              <w:rPr>
-                                <w:color w:val="943634"/>
-                              </w:rPr>
-                            </w:pPr>
-                            <w:r>
-                              <w:rPr>
-                                <w:color w:val="943634"/>
-                              </w:rPr>
-                              <w:t>+    LineárníPoloha: LineárníPoloha [0..1]</w:t>
-                            </w:r>
-                          </w:p>
-                          <w:p>
-                            <w:pPr>
-                              <w:pStyle w:val="Normal"/>
-                              <w:spacing w:before="0" w:after="40"/>
-                              <w:rPr>
-                                <w:color w:val="943634"/>
-                              </w:rPr>
-                            </w:pPr>
-                            <w:r>
-                              <w:rPr>
-                                <w:color w:val="943634"/>
-                              </w:rPr>
-                              <w:t>+    ExplicitníPolohaOblasti: ExplicitníPolohaOblasti [0..1]</w:t>
-                            </w:r>
-                          </w:p>
-                          <w:p>
-                            <w:pPr>
-                              <w:pStyle w:val="Normal"/>
-                              <w:spacing w:before="0" w:after="40"/>
-                              <w:rPr>
-                                <w:color w:val="943634"/>
-                              </w:rPr>
-                            </w:pPr>
-                            <w:r>
-                              <w:rPr>
-                                <w:color w:val="943634"/>
-                              </w:rPr>
-                              <w:t>+    ImplicitníPoziceOblasti: ImplicitníPoziceOblasti [0..1]</w:t>
-                            </w:r>
-                          </w:p>
-                          <w:p>
-                            <w:pPr>
-                              <w:pStyle w:val="Normal"/>
-                              <w:rPr/>
-                            </w:pPr>
-                            <w:r>
-                              <w:rPr>
-                                <w:color w:val="943634"/>
-                              </w:rPr>
-                            </w:r>
-                          </w:p>
-                        </w:txbxContent>
-                      </wps:txbx>
-                      <wps:bodyPr anchor="t" lIns="91440" tIns="91440" rIns="91440" bIns="91440">
-                        <a:noAutofit/>
-                      </wps:bodyPr>
-                    </wps:wsp>
-                  </a:graphicData>
-                </a:graphic>
-              </wp:anchor>
-            </w:drawing>
-          </mc:Choice>
-          <mc:Fallback>
-            <w:pict>
-              <v:rect fillcolor="#FFFFFF" strokecolor="#000000" strokeweight="0pt" style="position:absolute;rotation:-0;width:280.1pt;height:80.95pt;mso-wrap-distance-left:9.05pt;mso-wrap-distance-right:9.05pt;mso-wrap-distance-top:0pt;mso-wrap-distance-bottom:0pt;margin-top:2.55pt;mso-position-vertical-relative:text;margin-left:108pt;mso-position-horizontal-relative:text">
-                <v:textbox inset="0.1in,0.1in,0.1in,0.1in">
-                  <w:txbxContent>
-                    <w:p>
-                      <w:pPr>
-                        <w:pStyle w:val="Normal"/>
-                        <w:spacing w:before="0" w:after="40"/>
-                        <w:rPr>
-                          <w:color w:val="943634"/>
-                        </w:rPr>
-                      </w:pPr>
-                      <w:r>
-                        <w:rPr>
-                          <w:color w:val="943634"/>
-                        </w:rPr>
-                        <w:t>+   verze: IntUnTi</w:t>
-                      </w:r>
-                    </w:p>
-                    <w:p>
-                      <w:pPr>
-                        <w:pStyle w:val="Normal"/>
-                        <w:shd w:fill="EEECE1" w:val="clear"/>
-                        <w:spacing w:before="0" w:after="40"/>
-                        <w:rPr/>
-                      </w:pPr>
-                      <w:r>
-                        <w:rPr/>
-                        <w:t>«OrderedComponentGroup»</w:t>
-                      </w:r>
-                    </w:p>
-                    <w:p>
-                      <w:pPr>
-                        <w:pStyle w:val="Normal"/>
-                        <w:spacing w:before="0" w:after="40"/>
-                        <w:rPr>
-                          <w:color w:val="943634"/>
-                        </w:rPr>
-                      </w:pPr>
-                      <w:r>
-                        <w:rPr>
-                          <w:color w:val="943634"/>
-                        </w:rPr>
-                        <w:t>+    LineárníPoloha: LineárníPoloha [0..1]</w:t>
-                      </w:r>
-                    </w:p>
-                    <w:p>
-                      <w:pPr>
-                        <w:pStyle w:val="Normal"/>
-                        <w:spacing w:before="0" w:after="40"/>
-                        <w:rPr>
-                          <w:color w:val="943634"/>
-                        </w:rPr>
-                      </w:pPr>
-                      <w:r>
-                        <w:rPr>
-                          <w:color w:val="943634"/>
-                        </w:rPr>
-                        <w:t>+    ExplicitníPolohaOblasti: ExplicitníPolohaOblasti [0..1]</w:t>
-                      </w:r>
-                    </w:p>
-                    <w:p>
-                      <w:pPr>
-                        <w:pStyle w:val="Normal"/>
-                        <w:spacing w:before="0" w:after="40"/>
-                        <w:rPr>
-                          <w:color w:val="943634"/>
-                        </w:rPr>
-                      </w:pPr>
-                      <w:r>
-                        <w:rPr>
-                          <w:color w:val="943634"/>
-                        </w:rPr>
-                        <w:t>+    ImplicitníPoziceOblasti: ImplicitníPoziceOblasti [0..1]</w:t>
-                      </w:r>
-                    </w:p>
-                    <w:p>
-                      <w:pPr>
-                        <w:pStyle w:val="Normal"/>
-                        <w:rPr/>
-                      </w:pPr>
-                      <w:r>
-                        <w:rPr>
-                          <w:color w:val="943634"/>
-                        </w:rPr>
-                      </w:r>
-                    </w:p>
-                  </w:txbxContent>
-                </v:textbox>
-                <w10:wrap type="square"/>
-              </v:rect>
-            </w:pict>
-          </mc:Fallback>
-        </mc:AlternateContent>
-      </w:r>
-    </w:p>
-    <w:p>
-      <w:pPr>
-        <w:pStyle w:val="Normal"/>
-        <w:rPr>
-          <w:rFonts w:ascii="Cambria" w:hAnsi="Cambria" w:cs="Cambria"/>
-        </w:rPr>
-      </w:pPr>
-      <w:r>
-        <w:rPr>
-          <w:rFonts w:cs="Cambria" w:ascii="Cambria" w:hAnsi="Cambria"/>
-          <w:b/>
-        </w:rPr>
-        <w:tab/>
-      </w:r>
-    </w:p>
-    <w:p>
-      <w:pPr>
-        <w:pStyle w:val="Normal"/>
-        <w:rPr>
-          <w:rFonts w:ascii="Cambria" w:hAnsi="Cambria" w:cs="Cambria"/>
-        </w:rPr>
-      </w:pPr>
-      <w:r>
-        <w:rPr>
-          <w:rFonts w:cs="Cambria" w:ascii="Cambria" w:hAnsi="Cambria"/>
-        </w:rPr>
-      </w:r>
-    </w:p>
-    <w:p>
-      <w:pPr>
-        <w:pStyle w:val="Normal"/>
-        <w:rPr>
-          <w:rFonts w:ascii="Cambria" w:hAnsi="Cambria" w:cs="Cambria"/>
-        </w:rPr>
-      </w:pPr>
-      <w:r>
-        <w:rPr>
-          <w:rFonts w:cs="Cambria" w:ascii="Cambria" w:hAnsi="Cambria"/>
-        </w:rPr>
-      </w:r>
-    </w:p>
-    <w:p>
-      <w:pPr>
-        <w:pStyle w:val="Normal"/>
-        <w:rPr>
-          <w:rFonts w:ascii="Cambria" w:hAnsi="Cambria" w:cs="Cambria"/>
-        </w:rPr>
-      </w:pPr>
-      <w:r>
-        <w:rPr>
-          <w:rFonts w:cs="Cambria" w:ascii="Cambria" w:hAnsi="Cambria"/>
-        </w:rPr>
-      </w:r>
-    </w:p>
-    <w:p>
-      <w:pPr>
-        <w:pStyle w:val="Normal"/>
-        <w:rPr>
-          <w:rFonts w:ascii="Cambria" w:hAnsi="Cambria" w:cs="Cambria"/>
-        </w:rPr>
-      </w:pPr>
-      <w:r>
-        <w:rPr>
-          <w:rFonts w:cs="Cambria" w:ascii="Cambria" w:hAnsi="Cambria"/>
-        </w:rPr>
-      </w:r>
-    </w:p>
-    <w:p>
-      <w:pPr>
-        <w:pStyle w:val="Normal"/>
-        <w:rPr>
-          <w:rFonts w:ascii="Cambria" w:hAnsi="Cambria" w:cs="Cambria"/>
-        </w:rPr>
-      </w:pPr>
-      <w:r>
-        <mc:AlternateContent>
-          <mc:Choice Requires="wps">
-            <w:drawing>
-              <wp:anchor distT="0" distB="0" distL="114935" distR="114935" simplePos="0" relativeHeight="10" behindDoc="0" locked="0" layoutInCell="1" allowOverlap="1">
-                <wp:simplePos x="0" y="0"/>
-                <wp:positionH relativeFrom="column">
-                  <wp:posOffset>2025015</wp:posOffset>
-                </wp:positionH>
-                <wp:positionV relativeFrom="paragraph">
-                  <wp:posOffset>98425</wp:posOffset>
-                </wp:positionV>
-                <wp:extent cx="265430" cy="427990"/>
-                <wp:effectExtent l="0" t="2540" r="4445" b="0"/>
-                <wp:wrapNone/>
-                <wp:docPr id="6" name=""/>
-                <a:graphic xmlns:a="http://schemas.openxmlformats.org/drawingml/2006/main">
-                  <a:graphicData uri="http://schemas.microsoft.com/office/word/2010/wordprocessingShape">
-                    <wps:wsp>
-                      <wps:cNvCnPr/>
-                      <wps:spPr>
-                        <a:xfrm flipH="1">
-                          <a:off x="0" y="0"/>
-                          <a:ext cx="265680" cy="428400"/>
-                        </a:xfrm>
-                        <a:prstGeom prst="straightConnector1">
-                          <a:avLst/>
-                        </a:prstGeom>
-                        <a:ln w="9360">
-                          <a:solidFill>
-                            <a:srgbClr val="000000"/>
-                          </a:solidFill>
-                          <a:miter/>
-                          <a:tailEnd len="med" type="triangle" w="med"/>
-                        </a:ln>
-                      </wps:spPr>
-                      <wps:bodyPr/>
-                    </wps:wsp>
-                  </a:graphicData>
-                </a:graphic>
-              </wp:anchor>
-            </w:drawing>
-          </mc:Choice>
-          <mc:Fallback>
-            <w:pict>
-              <v:shapetype id="_x0000_t32" coordsize="21600,21600" o:spt="32" path="m,l21600,21600nfe">
-                <v:stroke joinstyle="miter"/>
-                <v:path gradientshapeok="t" o:connecttype="rect" textboxrect="0,0,21600,21600"/>
-              </v:shapetype>
-              <v:shape id="shape_0" stroked="t" o:allowincell="f" style="position:absolute;margin-left:159.45pt;margin-top:7.75pt;width:20.8pt;height:33.7pt;flip:x" type="_x0000_t32">
-                <v:stroke color="black" weight="9360" endarrow="block" endarrowwidth="medium" endarrowlength="medium" joinstyle="miter" endcap="flat"/>
-                <v:fill o:detectmouseclick="t" on="false"/>
-                <w10:wrap type="none"/>
-              </v:shape>
-            </w:pict>
-          </mc:Fallback>
-        </mc:AlternateContent>
-        <mc:AlternateContent>
-          <mc:Choice Requires="wps">
-            <w:drawing>
-              <wp:anchor distT="0" distB="0" distL="114935" distR="114935" simplePos="0" relativeHeight="11" behindDoc="0" locked="0" layoutInCell="1" allowOverlap="1">
-                <wp:simplePos x="0" y="0"/>
-                <wp:positionH relativeFrom="column">
-                  <wp:posOffset>3057525</wp:posOffset>
-                </wp:positionH>
-                <wp:positionV relativeFrom="paragraph">
-                  <wp:posOffset>98425</wp:posOffset>
-                </wp:positionV>
-                <wp:extent cx="1270" cy="427990"/>
-                <wp:effectExtent l="37465" t="635" r="38100" b="0"/>
-                <wp:wrapNone/>
-                <wp:docPr id="7" name=""/>
-                <a:graphic xmlns:a="http://schemas.openxmlformats.org/drawingml/2006/main">
-                  <a:graphicData uri="http://schemas.microsoft.com/office/word/2010/wordprocessingShape">
-                    <wps:wsp>
-                      <wps:cNvCnPr/>
-                      <wps:spPr>
-                        <a:xfrm>
-                          <a:off x="0" y="0"/>
-                          <a:ext cx="1800" cy="428400"/>
-                        </a:xfrm>
-                        <a:prstGeom prst="straightConnector1">
-                          <a:avLst/>
-                        </a:prstGeom>
-                        <a:ln w="9360">
-                          <a:solidFill>
-                            <a:srgbClr val="000000"/>
-                          </a:solidFill>
-                          <a:miter/>
-                          <a:tailEnd len="med" type="triangle" w="med"/>
-                        </a:ln>
-                      </wps:spPr>
-                      <wps:bodyPr/>
-                    </wps:wsp>
-                  </a:graphicData>
-                </a:graphic>
-              </wp:anchor>
-            </w:drawing>
-          </mc:Choice>
-          <mc:Fallback>
-            <w:pict>
-              <v:shape id="shape_0" stroked="t" o:allowincell="f" style="position:absolute;margin-left:240.75pt;margin-top:7.75pt;width:0.1pt;height:33.7pt" type="_x0000_t32">
-                <v:stroke color="black" weight="9360" endarrow="block" endarrowwidth="medium" endarrowlength="medium" joinstyle="miter" endcap="flat"/>
-                <v:fill o:detectmouseclick="t" on="false"/>
-                <w10:wrap type="none"/>
-              </v:shape>
-            </w:pict>
-          </mc:Fallback>
-        </mc:AlternateContent>
-        <mc:AlternateContent>
-          <mc:Choice Requires="wps">
-            <w:drawing>
-              <wp:anchor distT="0" distB="0" distL="114935" distR="114935" simplePos="0" relativeHeight="12" behindDoc="0" locked="0" layoutInCell="1" allowOverlap="1">
-                <wp:simplePos x="0" y="0"/>
-                <wp:positionH relativeFrom="column">
-                  <wp:posOffset>3782060</wp:posOffset>
-                </wp:positionH>
-                <wp:positionV relativeFrom="paragraph">
-                  <wp:posOffset>98425</wp:posOffset>
-                </wp:positionV>
-                <wp:extent cx="321310" cy="427990"/>
-                <wp:effectExtent l="3810" t="3175" r="0" b="0"/>
-                <wp:wrapNone/>
-                <wp:docPr id="8" name=""/>
-                <a:graphic xmlns:a="http://schemas.openxmlformats.org/drawingml/2006/main">
-                  <a:graphicData uri="http://schemas.microsoft.com/office/word/2010/wordprocessingShape">
-                    <wps:wsp>
-                      <wps:cNvCnPr/>
-                      <wps:spPr>
-                        <a:xfrm>
-                          <a:off x="0" y="0"/>
-                          <a:ext cx="321480" cy="428400"/>
-                        </a:xfrm>
-                        <a:prstGeom prst="straightConnector1">
-                          <a:avLst/>
-                        </a:prstGeom>
-                        <a:ln w="9360">
-                          <a:solidFill>
-                            <a:srgbClr val="000000"/>
-                          </a:solidFill>
-                          <a:miter/>
-                          <a:tailEnd len="med" type="triangle" w="med"/>
-                        </a:ln>
-                      </wps:spPr>
-                      <wps:bodyPr/>
-                    </wps:wsp>
-                  </a:graphicData>
-                </a:graphic>
-              </wp:anchor>
-            </w:drawing>
-          </mc:Choice>
-          <mc:Fallback>
-            <w:pict>
-              <v:shape id="shape_0" stroked="t" o:allowincell="f" style="position:absolute;margin-left:297.8pt;margin-top:7.75pt;width:25.25pt;height:33.7pt" type="_x0000_t32">
-                <v:stroke color="black" weight="9360" endarrow="block" endarrowwidth="medium" endarrowlength="medium" joinstyle="miter" endcap="flat"/>
-                <v:fill o:detectmouseclick="t" on="false"/>
-                <w10:wrap type="none"/>
-              </v:shape>
-            </w:pict>
-          </mc:Fallback>
-        </mc:AlternateContent>
-      </w:r>
-      <w:r>
-        <w:rPr>
-          <w:rFonts w:cs="Cambria" w:ascii="Cambria" w:hAnsi="Cambria"/>
-          <w:lang w:val="en-US" w:eastAsia="en-US"/>
-        </w:rPr>
-        <w:t>/</w:t>
-      </w:r>
-    </w:p>
-    <w:p>
-      <w:pPr>
-        <w:pStyle w:val="Normal"/>
-        <w:rPr>
-          <w:rFonts w:ascii="Cambria" w:hAnsi="Cambria" w:cs="Cambria"/>
-        </w:rPr>
-      </w:pPr>
-      <w:r>
-        <w:rPr>
-          <w:rFonts w:cs="Cambria" w:ascii="Cambria" w:hAnsi="Cambria"/>
-          <w:b/>
-        </w:rPr>
-        <w:tab/>
-        <w:tab/>
-      </w:r>
-    </w:p>
-    <w:p>
-      <w:pPr>
-        <w:pStyle w:val="Normal"/>
-        <w:rPr>
-          <w:rFonts w:ascii="Cambria" w:hAnsi="Cambria" w:cs="Cambria"/>
-        </w:rPr>
-      </w:pPr>
-      <w:r>
-        <w:rPr>
-          <w:rFonts w:cs="Cambria" w:ascii="Cambria" w:hAnsi="Cambria"/>
-        </w:rPr>
-      </w:r>
-    </w:p>
-    <w:p>
-      <w:pPr>
-        <w:pStyle w:val="Normal"/>
-        <w:rPr>
-          <w:rFonts w:ascii="Cambria" w:hAnsi="Cambria" w:cs="Cambria"/>
-        </w:rPr>
-      </w:pPr>
-      <w:r>
-        <w:rPr>
-          <w:rFonts w:cs="Cambria" w:ascii="Cambria" w:hAnsi="Cambria"/>
-          <w:lang w:val="en-US" w:eastAsia="en-US"/>
-        </w:rPr>
-      </w:r>
-      <w:r>
-        <mc:AlternateContent>
-          <mc:Choice Requires="wps">
-            <w:drawing>
-              <wp:anchor distT="0" distB="0" distL="114935" distR="114935" simplePos="0" relativeHeight="7" behindDoc="0" locked="0" layoutInCell="1" allowOverlap="1">
-                <wp:simplePos x="0" y="0"/>
-                <wp:positionH relativeFrom="column">
-                  <wp:posOffset>398145</wp:posOffset>
-                </wp:positionH>
-                <wp:positionV relativeFrom="paragraph">
-                  <wp:posOffset>78105</wp:posOffset>
-                </wp:positionV>
-                <wp:extent cx="1636395" cy="372110"/>
-                <wp:effectExtent l="0" t="0" r="0" b="0"/>
-                <wp:wrapNone/>
-                <wp:docPr id="9" name="Frame3"/>
-                <a:graphic xmlns:a="http://schemas.openxmlformats.org/drawingml/2006/main">
-                  <a:graphicData uri="http://schemas.microsoft.com/office/word/2010/wordprocessingShape">
-                    <wps:wsp>
-                      <wps:cNvSpPr txBox="1"/>
-                      <wps:spPr>
-                        <a:xfrm>
-                          <a:off x="0" y="0"/>
-                          <a:ext cx="1636395" cy="372110"/>
-                        </a:xfrm>
-                        <a:prstGeom prst="rect"/>
-                        <a:solidFill>
-                          <a:srgbClr val="FFFFFF"/>
-                        </a:solidFill>
-                        <a:ln w="9525">
-                          <a:solidFill>
-                            <a:srgbClr val="000000"/>
-                          </a:solidFill>
-                        </a:ln>
-                      </wps:spPr>
-                      <wps:txbx>
-                        <w:txbxContent>
-                          <w:p>
-                            <w:pPr>
-                              <w:pStyle w:val="Normal"/>
-                              <w:jc w:val="center"/>
-                              <w:rPr/>
-                            </w:pPr>
-                            <w:r>
-                              <w:rPr/>
-                              <w:t>LineárníPoloha</w:t>
-                            </w:r>
-                          </w:p>
-                          <w:p>
-                            <w:pPr>
-                              <w:pStyle w:val="Normal"/>
-                              <w:rPr/>
-                            </w:pPr>
-                            <w:r>
-                              <w:rPr/>
-                            </w:r>
-                          </w:p>
-                        </w:txbxContent>
-                      </wps:txbx>
-                      <wps:bodyPr anchor="t" lIns="91440" tIns="91440" rIns="91440" bIns="91440">
-                        <a:noAutofit/>
-                      </wps:bodyPr>
-                    </wps:wsp>
-                  </a:graphicData>
-                </a:graphic>
-              </wp:anchor>
-            </w:drawing>
-          </mc:Choice>
-          <mc:Fallback>
-            <w:pict>
-              <v:rect fillcolor="#FFFFFF" strokecolor="#000000" strokeweight="0pt" style="position:absolute;rotation:-0;width:128.85pt;height:29.3pt;mso-wrap-distance-left:9.05pt;mso-wrap-distance-right:9.05pt;mso-wrap-distance-top:0pt;mso-wrap-distance-bottom:0pt;margin-top:6.15pt;mso-position-vertical-relative:text;margin-left:31.35pt;mso-position-horizontal-relative:text">
-                <v:textbox inset="0.1in,0.1in,0.1in,0.1in">
-                  <w:txbxContent>
-                    <w:p>
-                      <w:pPr>
-                        <w:pStyle w:val="Normal"/>
-                        <w:jc w:val="center"/>
-                        <w:rPr/>
-                      </w:pPr>
-                      <w:r>
-                        <w:rPr/>
-                        <w:t>LineárníPoloha</w:t>
-                      </w:r>
-                    </w:p>
-                    <w:p>
-                      <w:pPr>
-                        <w:pStyle w:val="Normal"/>
-                        <w:rPr/>
-                      </w:pPr>
-                      <w:r>
-                        <w:rPr/>
-                      </w:r>
-                    </w:p>
-                  </w:txbxContent>
-                </v:textbox>
-                <w10:wrap type="none"/>
-              </v:rect>
-            </w:pict>
-          </mc:Fallback>
-        </mc:AlternateContent>
-      </w:r>
-      <w:r>
-        <mc:AlternateContent>
-          <mc:Choice Requires="wps">
-            <w:drawing>
-              <wp:anchor distT="0" distB="0" distL="114935" distR="114935" simplePos="0" relativeHeight="8" behindDoc="0" locked="0" layoutInCell="1" allowOverlap="1">
-                <wp:simplePos x="0" y="0"/>
-                <wp:positionH relativeFrom="column">
-                  <wp:posOffset>2280285</wp:posOffset>
-                </wp:positionH>
-                <wp:positionV relativeFrom="paragraph">
-                  <wp:posOffset>78105</wp:posOffset>
-                </wp:positionV>
-                <wp:extent cx="1635125" cy="372110"/>
-                <wp:effectExtent l="0" t="0" r="0" b="0"/>
-                <wp:wrapNone/>
-                <wp:docPr id="10" name="Frame5"/>
-                <a:graphic xmlns:a="http://schemas.openxmlformats.org/drawingml/2006/main">
-                  <a:graphicData uri="http://schemas.microsoft.com/office/word/2010/wordprocessingShape">
-                    <wps:wsp>
-                      <wps:cNvSpPr txBox="1"/>
-                      <wps:spPr>
-                        <a:xfrm>
-                          <a:off x="0" y="0"/>
-                          <a:ext cx="1635125" cy="372110"/>
-                        </a:xfrm>
-                        <a:prstGeom prst="rect"/>
-                        <a:solidFill>
-                          <a:srgbClr val="FFFFFF"/>
-                        </a:solidFill>
-                        <a:ln w="9525">
-                          <a:solidFill>
-                            <a:srgbClr val="000000"/>
-                          </a:solidFill>
-                        </a:ln>
-                      </wps:spPr>
-                      <wps:txbx>
-                        <w:txbxContent>
-                          <w:p>
-                            <w:pPr>
-                              <w:pStyle w:val="Normal"/>
-                              <w:jc w:val="center"/>
-                              <w:rPr>
-                                <w:sz w:val="18"/>
-                                <w:szCs w:val="18"/>
-                              </w:rPr>
-                            </w:pPr>
-                            <w:r>
-                              <w:rPr/>
-                              <w:t>Exp</w:t>
-                            </w:r>
-                            <w:r>
-                              <w:rPr>
-                                <w:sz w:val="18"/>
-                                <w:szCs w:val="18"/>
-                              </w:rPr>
-                              <w:t>l</w:t>
-                            </w:r>
-                            <w:r>
-                              <w:rPr/>
-                              <w:t>icitníPolohaOblasti</w:t>
-                            </w:r>
-                          </w:p>
-                          <w:p>
-                            <w:pPr>
-                              <w:pStyle w:val="Normal"/>
-                              <w:rPr/>
-                            </w:pPr>
-                            <w:r>
-                              <w:rPr>
-                                <w:sz w:val="18"/>
-                                <w:szCs w:val="18"/>
-                              </w:rPr>
-                            </w:r>
-                          </w:p>
-                        </w:txbxContent>
-                      </wps:txbx>
-                      <wps:bodyPr anchor="t" lIns="91440" tIns="91440" rIns="91440" bIns="91440">
-                        <a:noAutofit/>
-                      </wps:bodyPr>
-                    </wps:wsp>
-                  </a:graphicData>
-                </a:graphic>
-              </wp:anchor>
-            </w:drawing>
-          </mc:Choice>
-          <mc:Fallback>
-            <w:pict>
-              <v:rect fillcolor="#FFFFFF" strokecolor="#000000" strokeweight="0pt" style="position:absolute;rotation:-0;width:128.75pt;height:29.3pt;mso-wrap-distance-left:9.05pt;mso-wrap-distance-right:9.05pt;mso-wrap-distance-top:0pt;mso-wrap-distance-bottom:0pt;margin-top:6.15pt;mso-position-vertical-relative:text;margin-left:179.55pt;mso-position-horizontal-relative:text">
-                <v:textbox inset="0.1in,0.1in,0.1in,0.1in">
-                  <w:txbxContent>
-                    <w:p>
-                      <w:pPr>
-                        <w:pStyle w:val="Normal"/>
-                        <w:jc w:val="center"/>
-                        <w:rPr>
-                          <w:sz w:val="18"/>
-                          <w:szCs w:val="18"/>
-                        </w:rPr>
-                      </w:pPr>
-                      <w:r>
-                        <w:rPr/>
-                        <w:t>Exp</w:t>
-                      </w:r>
-                      <w:r>
-                        <w:rPr>
-                          <w:sz w:val="18"/>
-                          <w:szCs w:val="18"/>
-                        </w:rPr>
-                        <w:t>l</w:t>
-                      </w:r>
-                      <w:r>
-                        <w:rPr/>
-                        <w:t>icitníPolohaOblasti</w:t>
-                      </w:r>
-                    </w:p>
-                    <w:p>
-                      <w:pPr>
-                        <w:pStyle w:val="Normal"/>
-                        <w:rPr/>
-                      </w:pPr>
-                      <w:r>
-                        <w:rPr>
-                          <w:sz w:val="18"/>
-                          <w:szCs w:val="18"/>
-                        </w:rPr>
-                      </w:r>
-                    </w:p>
-                  </w:txbxContent>
-                </v:textbox>
-                <w10:wrap type="none"/>
-              </v:rect>
-            </w:pict>
-          </mc:Fallback>
-        </mc:AlternateContent>
-      </w:r>
-      <w:r>
-        <mc:AlternateContent>
-          <mc:Choice Requires="wps">
-            <w:drawing>
-              <wp:anchor distT="0" distB="0" distL="114935" distR="114935" simplePos="0" relativeHeight="9" behindDoc="0" locked="0" layoutInCell="1" allowOverlap="1">
-                <wp:simplePos x="0" y="0"/>
-                <wp:positionH relativeFrom="column">
-                  <wp:posOffset>4093210</wp:posOffset>
-                </wp:positionH>
-                <wp:positionV relativeFrom="paragraph">
-                  <wp:posOffset>78105</wp:posOffset>
-                </wp:positionV>
-                <wp:extent cx="1635125" cy="372110"/>
-                <wp:effectExtent l="0" t="0" r="0" b="0"/>
-                <wp:wrapNone/>
-                <wp:docPr id="11" name="Frame4"/>
-                <a:graphic xmlns:a="http://schemas.openxmlformats.org/drawingml/2006/main">
-                  <a:graphicData uri="http://schemas.microsoft.com/office/word/2010/wordprocessingShape">
-                    <wps:wsp>
-                      <wps:cNvSpPr txBox="1"/>
-                      <wps:spPr>
-                        <a:xfrm>
-                          <a:off x="0" y="0"/>
-                          <a:ext cx="1635125" cy="372110"/>
-                        </a:xfrm>
-                        <a:prstGeom prst="rect"/>
-                        <a:solidFill>
-                          <a:srgbClr val="FFFFFF"/>
-                        </a:solidFill>
-                        <a:ln w="9525">
-                          <a:solidFill>
-                            <a:srgbClr val="000000"/>
-                          </a:solidFill>
-                        </a:ln>
-                      </wps:spPr>
-                      <wps:txbx>
-                        <w:txbxContent>
-                          <w:p>
-                            <w:pPr>
-                              <w:pStyle w:val="Normal"/>
-                              <w:jc w:val="center"/>
-                              <w:rPr/>
-                            </w:pPr>
-                            <w:r>
-                              <w:rPr/>
-                              <w:t>ImplicitníPolohaOblasti</w:t>
-                            </w:r>
-                          </w:p>
-                          <w:p>
-                            <w:pPr>
-                              <w:pStyle w:val="Normal"/>
-                              <w:rPr/>
-                            </w:pPr>
-                            <w:r>
-                              <w:rPr/>
-                            </w:r>
-                          </w:p>
-                        </w:txbxContent>
-                      </wps:txbx>
-                      <wps:bodyPr anchor="t" lIns="91440" tIns="91440" rIns="91440" bIns="91440">
-                        <a:noAutofit/>
-                      </wps:bodyPr>
-                    </wps:wsp>
-                  </a:graphicData>
-                </a:graphic>
-              </wp:anchor>
-            </w:drawing>
-          </mc:Choice>
-          <mc:Fallback>
-            <w:pict>
-              <v:rect fillcolor="#FFFFFF" strokecolor="#000000" strokeweight="0pt" style="position:absolute;rotation:-0;width:128.75pt;height:29.3pt;mso-wrap-distance-left:9.05pt;mso-wrap-distance-right:9.05pt;mso-wrap-distance-top:0pt;mso-wrap-distance-bottom:0pt;margin-top:6.15pt;mso-position-vertical-relative:text;margin-left:322.3pt;mso-position-horizontal-relative:text">
-                <v:textbox inset="0.1in,0.1in,0.1in,0.1in">
-                  <w:txbxContent>
-                    <w:p>
-                      <w:pPr>
-                        <w:pStyle w:val="Normal"/>
-                        <w:jc w:val="center"/>
-                        <w:rPr/>
-                      </w:pPr>
-                      <w:r>
-                        <w:rPr/>
-                        <w:t>ImplicitníPolohaOblasti</w:t>
-                      </w:r>
-                    </w:p>
-                    <w:p>
-                      <w:pPr>
-                        <w:pStyle w:val="Normal"/>
-                        <w:rPr/>
-                      </w:pPr>
-                      <w:r>
-                        <w:rPr/>
-                      </w:r>
-                    </w:p>
-                  </w:txbxContent>
-                </v:textbox>
-                <w10:wrap type="none"/>
-              </v:rect>
-            </w:pict>
-          </mc:Fallback>
-        </mc:AlternateContent>
-      </w:r>
-    </w:p>
-    <w:p>
-      <w:pPr>
-        <w:pStyle w:val="Normal"/>
-        <w:rPr>
-          <w:rFonts w:ascii="Cambria" w:hAnsi="Cambria" w:cs="Cambria"/>
-        </w:rPr>
-      </w:pPr>
-      <w:r>
-        <w:rPr>
-          <w:rFonts w:cs="Cambria" w:ascii="Cambria" w:hAnsi="Cambria"/>
-        </w:rPr>
-      </w:r>
-    </w:p>
-    <w:p>
-      <w:pPr>
-        <w:pStyle w:val="Normal"/>
-        <w:rPr/>
-      </w:pPr>
-      <w:r>
-        <w:rPr>
-          <w:rFonts w:cs="Cambria" w:ascii="Cambria" w:hAnsi="Cambria"/>
-        </w:rPr>
-      </w:r>
-    </w:p>
-    <w:p>
-      <w:pPr>
-        <w:pStyle w:val="NadpisTabObr"/>
-        <w:rPr/>
-      </w:pPr>
-      <w:r>
-        <w:rPr>
-          <w:lang w:val="en-US" w:eastAsia="en-US"/>
-        </w:rPr>
-        <mc:AlternateContent>
-          <mc:Choice Requires="wps">
-            <w:drawing>
-              <wp:anchor distT="0" distB="0" distL="114935" distR="114935" simplePos="0" relativeHeight="13" behindDoc="0" locked="0" layoutInCell="1" allowOverlap="1">
-                <wp:simplePos x="0" y="0"/>
-                <wp:positionH relativeFrom="column">
-                  <wp:posOffset>407670</wp:posOffset>
-                </wp:positionH>
-                <wp:positionV relativeFrom="paragraph">
-                  <wp:posOffset>2540</wp:posOffset>
-                </wp:positionV>
-                <wp:extent cx="1617345" cy="297180"/>
-                <wp:effectExtent l="5715" t="5080" r="4445" b="5080"/>
-                <wp:wrapNone/>
-                <wp:docPr id="12" name=""/>
-                <a:graphic xmlns:a="http://schemas.openxmlformats.org/drawingml/2006/main">
-                  <a:graphicData uri="http://schemas.microsoft.com/office/word/2010/wordprocessingShape">
-                    <wps:wsp>
-                      <wps:cNvSpPr/>
-                      <wps:spPr>
-                        <a:xfrm>
-                          <a:off x="0" y="0"/>
-                          <a:ext cx="1617480" cy="297360"/>
-                        </a:xfrm>
-                        <a:prstGeom prst="rect">
-                          <a:avLst/>
-                        </a:prstGeom>
-                        <a:solidFill>
-                          <a:srgbClr val="FFFFFF"/>
-                        </a:solidFill>
-                        <a:ln w="9360">
-                          <a:solidFill>
-                            <a:srgbClr val="000000"/>
-                          </a:solidFill>
-                          <a:miter/>
-                        </a:ln>
-                      </wps:spPr>
-                      <wps:style>
-                        <a:lnRef idx="0"/>
-                        <a:fillRef idx="0"/>
-                        <a:effectRef idx="0"/>
-                        <a:fontRef idx="minor"/>
-                      </wps:style>
-                      <wps:bodyPr/>
-                    </wps:wsp>
-                  </a:graphicData>
-                </a:graphic>
-              </wp:anchor>
-            </w:drawing>
-          </mc:Choice>
-          <mc:Fallback>
-            <w:pict>
-              <v:rect id="shape_0" fillcolor="white" stroked="t" o:allowincell="f" style="position:absolute;margin-left:32.1pt;margin-top:0.2pt;width:127.3pt;height:23.35pt;mso-wrap-style:none;v-text-anchor:middle">
-                <v:fill o:detectmouseclick="t" type="solid" color2="black"/>
-                <v:stroke color="black" weight="9360" joinstyle="miter" endcap="flat"/>
-                <w10:wrap type="none"/>
-              </v:rect>
-            </w:pict>
-          </mc:Fallback>
-        </mc:AlternateContent>
-        <mc:AlternateContent>
-          <mc:Choice Requires="wps">
-            <w:drawing>
-              <wp:anchor distT="0" distB="0" distL="114935" distR="114935" simplePos="0" relativeHeight="14" behindDoc="0" locked="0" layoutInCell="1" allowOverlap="1">
-                <wp:simplePos x="0" y="0"/>
-                <wp:positionH relativeFrom="column">
-                  <wp:posOffset>2289810</wp:posOffset>
-                </wp:positionH>
-                <wp:positionV relativeFrom="paragraph">
-                  <wp:posOffset>2540</wp:posOffset>
-                </wp:positionV>
-                <wp:extent cx="1617345" cy="297180"/>
-                <wp:effectExtent l="5715" t="5080" r="4445" b="5080"/>
-                <wp:wrapNone/>
-                <wp:docPr id="13" name=""/>
-                <a:graphic xmlns:a="http://schemas.openxmlformats.org/drawingml/2006/main">
-                  <a:graphicData uri="http://schemas.microsoft.com/office/word/2010/wordprocessingShape">
-                    <wps:wsp>
-                      <wps:cNvSpPr/>
-                      <wps:spPr>
-                        <a:xfrm>
-                          <a:off x="0" y="0"/>
-                          <a:ext cx="1617480" cy="297360"/>
-                        </a:xfrm>
-                        <a:prstGeom prst="rect">
-                          <a:avLst/>
-                        </a:prstGeom>
-                        <a:solidFill>
-                          <a:srgbClr val="FFFFFF"/>
-                        </a:solidFill>
-                        <a:ln w="9360">
-                          <a:solidFill>
-                            <a:srgbClr val="000000"/>
-                          </a:solidFill>
-                          <a:miter/>
-                        </a:ln>
-                      </wps:spPr>
-                      <wps:style>
-                        <a:lnRef idx="0"/>
-                        <a:fillRef idx="0"/>
-                        <a:effectRef idx="0"/>
-                        <a:fontRef idx="minor"/>
-                      </wps:style>
-                      <wps:bodyPr/>
-                    </wps:wsp>
-                  </a:graphicData>
-                </a:graphic>
-              </wp:anchor>
-            </w:drawing>
-          </mc:Choice>
-          <mc:Fallback>
-            <w:pict>
-              <v:rect id="shape_0" fillcolor="white" stroked="t" o:allowincell="f" style="position:absolute;margin-left:180.3pt;margin-top:0.2pt;width:127.3pt;height:23.35pt;mso-wrap-style:none;v-text-anchor:middle">
-                <v:fill o:detectmouseclick="t" type="solid" color2="black"/>
-                <v:stroke color="black" weight="9360" joinstyle="miter" endcap="flat"/>
-                <w10:wrap type="none"/>
-              </v:rect>
-            </w:pict>
-          </mc:Fallback>
-        </mc:AlternateContent>
-        <mc:AlternateContent>
-          <mc:Choice Requires="wps">
-            <w:drawing>
-              <wp:anchor distT="0" distB="0" distL="114935" distR="114935" simplePos="0" relativeHeight="15" behindDoc="0" locked="0" layoutInCell="1" allowOverlap="1">
-                <wp:simplePos x="0" y="0"/>
-                <wp:positionH relativeFrom="column">
-                  <wp:posOffset>4102735</wp:posOffset>
-                </wp:positionH>
-                <wp:positionV relativeFrom="paragraph">
-                  <wp:posOffset>2540</wp:posOffset>
-                </wp:positionV>
-                <wp:extent cx="1617345" cy="297180"/>
-                <wp:effectExtent l="5715" t="5080" r="4445" b="5080"/>
-                <wp:wrapNone/>
-                <wp:docPr id="14" name=""/>
-                <a:graphic xmlns:a="http://schemas.openxmlformats.org/drawingml/2006/main">
-                  <a:graphicData uri="http://schemas.microsoft.com/office/word/2010/wordprocessingShape">
-                    <wps:wsp>
-                      <wps:cNvSpPr/>
-                      <wps:spPr>
-                        <a:xfrm>
-                          <a:off x="0" y="0"/>
-                          <a:ext cx="1617480" cy="297360"/>
-                        </a:xfrm>
-                        <a:prstGeom prst="rect">
-                          <a:avLst/>
-                        </a:prstGeom>
-                        <a:solidFill>
-                          <a:srgbClr val="FFFFFF"/>
-                        </a:solidFill>
-                        <a:ln w="9360">
-                          <a:solidFill>
-                            <a:srgbClr val="000000"/>
-                          </a:solidFill>
-                          <a:miter/>
-                        </a:ln>
-                      </wps:spPr>
-                      <wps:style>
-                        <a:lnRef idx="0"/>
-                        <a:fillRef idx="0"/>
-                        <a:effectRef idx="0"/>
-                        <a:fontRef idx="minor"/>
-                      </wps:style>
-                      <wps:bodyPr/>
-                    </wps:wsp>
-                  </a:graphicData>
-                </a:graphic>
-              </wp:anchor>
-            </w:drawing>
-          </mc:Choice>
-          <mc:Fallback>
-            <w:pict>
-              <v:rect id="shape_0" fillcolor="white" stroked="t" o:allowincell="f" style="position:absolute;margin-left:323.05pt;margin-top:0.2pt;width:127.3pt;height:23.35pt;mso-wrap-style:none;v-text-anchor:middle">
-                <v:fill o:detectmouseclick="t" type="solid" color2="black"/>
-                <v:stroke color="black" weight="9360" joinstyle="miter" endcap="flat"/>
-                <w10:wrap type="none"/>
-              </v:rect>
-            </w:pict>
-          </mc:Fallback>
-        </mc:AlternateContent>
+        <w:rPr/>
+      </w:pPr>
+      <w:r>
+        <w:drawing>
+          <wp:inline xmlns:a="http://schemas.openxmlformats.org/drawingml/2006/main">
+            <wp:extent cx="5462016" cy="2554224"/>
+            <wp:docPr id="17" name="Picture 17"/>
+            <wp:cNvGraphicFramePr>
+              <a:graphicFrameLocks noChangeAspect="1"/>
+            </wp:cNvGraphicFramePr>
+            <a:graphic>
+              <a:graphicData uri="http://schemas.openxmlformats.org/drawingml/2006/picture">
+                <pic:pic>
+                  <pic:nvPicPr>
+                    <pic:cNvPr id="0" name="obr4.png"/>
+                    <pic:cNvPicPr/>
+                  </pic:nvPicPr>
+                  <pic:blipFill>
+                    <a:blip r:embed="rId15"/>
+                    <a:stretch>
+                      <a:fillRect/>
+                    </a:stretch>
+                  </pic:blipFill>
+                  <pic:spPr>
+                    <a:xfrm>
+                      <a:off x="0" y="0"/>
+                      <a:ext cx="5462016" cy="2554224"/>
+                    </a:xfrm>
+                    <a:prstGeom prst="rect"/>
+                  </pic:spPr>
+                </pic:pic>
+              </a:graphicData>
+            </a:graphic>
+          </wp:inline>
+        </w:drawing>
       </w:r>
     </w:p>
     <w:p>
@@ -3608,71 +2432,38 @@
         <w:rPr/>
       </w:pPr>
       <w:r>
-        <w:rPr/>
         <w:drawing>
-          <wp:inline distT="0" distB="0" distL="0" distR="0">
-            <wp:extent cx="6294120" cy="845185"/>
-            <wp:effectExtent l="0" t="0" r="0" b="0"/>
-            <wp:docPr id="15" name="Image1"/>
+          <wp:inline xmlns:a="http://schemas.openxmlformats.org/drawingml/2006/main">
+            <wp:extent cx="5760000" cy="1087318"/>
+            <wp:docPr id="16" name="Picture 16"/>
             <wp:cNvGraphicFramePr>
-              <a:graphicFrameLocks xmlns:a="http://schemas.openxmlformats.org/drawingml/2006/main" noChangeAspect="1"/>
+              <a:graphicFrameLocks noChangeAspect="1"/>
             </wp:cNvGraphicFramePr>
-            <a:graphic xmlns:a="http://schemas.openxmlformats.org/drawingml/2006/main">
+            <a:graphic>
               <a:graphicData uri="http://schemas.openxmlformats.org/drawingml/2006/picture">
-                <pic:pic xmlns:pic="http://schemas.openxmlformats.org/drawingml/2006/picture">
+                <pic:pic>
                   <pic:nvPicPr>
-                    <pic:cNvPr id="15" name="Image1"/>
-                    <pic:cNvPicPr>
-                      <a:picLocks noChangeAspect="1" noChangeArrowheads="1"/>
-                    </pic:cNvPicPr>
+                    <pic:cNvPr id="0" name="obr5.png"/>
+                    <pic:cNvPicPr/>
                   </pic:nvPicPr>
                   <pic:blipFill>
-                    <a:blip r:embed="rId6"/>
-                    <a:srcRect l="-4" t="-33" r="-4" b="-33"/>
+                    <a:blip r:embed="rId14"/>
                     <a:stretch>
                       <a:fillRect/>
                     </a:stretch>
                   </pic:blipFill>
-                  <pic:spPr bwMode="auto">
+                  <pic:spPr>
                     <a:xfrm>
                       <a:off x="0" y="0"/>
-                      <a:ext cx="6294120" cy="845185"/>
+                      <a:ext cx="5760000" cy="1087318"/>
                     </a:xfrm>
-                    <a:prstGeom prst="rect">
-                      <a:avLst/>
-                    </a:prstGeom>
-                    <a:noFill/>
+                    <a:prstGeom prst="rect"/>
                   </pic:spPr>
                 </pic:pic>
               </a:graphicData>
             </a:graphic>
           </wp:inline>
         </w:drawing>
-      </w:r>
-    </w:p>
-    <w:p>
-      <w:pPr>
-        <w:pStyle w:val="Normal"/>
-        <w:tabs>
-          <w:tab w:val="clear" w:pos="709"/>
-          <w:tab w:val="left" w:pos="567" w:leader="none"/>
-          <w:tab w:val="left" w:pos="3261" w:leader="none"/>
-        </w:tabs>
-        <w:spacing w:before="120" w:after="0"/>
-        <w:rPr/>
-      </w:pPr>
-      <w:r>
-        <w:rPr/>
-        <w:tab/>
-      </w:r>
-      <w:r>
-        <w:rPr>
-          <w:b/>
-        </w:rPr>
-        <w:t xml:space="preserve">definice zakřivení </w:t>
-        <w:tab/>
-        <w:t>jednoduchá výpočetní metoda (1)    jednoduchá výpočetní metoda (2)</w:t>
-        <w:br/>
       </w:r>
     </w:p>
     <w:p>

</xml_diff>